<commit_message>
Audit Lab13 writeups and standardize boilerplate statistical wording
</commit_message>
<xml_diff>
--- a/Lab13/lab13_output/lab_13.docx key.docx
+++ b/Lab13/lab13_output/lab_13.docx key.docx
@@ -497,9 +497,27 @@
       </w:pPr>
       <w:r>
         <w:rPr>
-          <w:rStyle w:val="CommentTok"/>
-        </w:rPr>
-        <w:t xml:space="preserve"># setwd("/path/to/StatsII-Labs/Lab13")</w:t>
+          <w:rStyle w:val="FunctionTok"/>
+        </w:rPr>
+        <w:t xml:space="preserve">setwd</w:t>
+      </w:r>
+      <w:r>
+        <w:rPr>
+          <w:rStyle w:val="NormalTok"/>
+        </w:rPr>
+        <w:t xml:space="preserve">(</w:t>
+      </w:r>
+      <w:r>
+        <w:rPr>
+          <w:rStyle w:val="StringTok"/>
+        </w:rPr>
+        <w:t xml:space="preserve">"/Users/dannyzweben/Desktop/GradClass/Y1/S2/StatsII/StatsII-Labs/Lab13"</w:t>
+      </w:r>
+      <w:r>
+        <w:rPr>
+          <w:rStyle w:val="NormalTok"/>
+        </w:rPr>
+        <w:t xml:space="preserve">)</w:t>
       </w:r>
       <w:r>
         <w:br/>
@@ -533,7 +551,7 @@
         <w:rPr>
           <w:rStyle w:val="VerbatimChar"/>
         </w:rPr>
-        <w:t xml:space="preserve">## [1] "/Users/dannyzweben/Desktop/GradClass/Y1/S2/StatsII/StatsII-Labs/Lab13/lab13_output"</w:t>
+        <w:t xml:space="preserve">## [1] "/Users/dannyzweben/Desktop/GradClass/Y1/S2/StatsII/StatsII-Labs/Lab13"</w:t>
       </w:r>
     </w:p>
     <w:bookmarkEnd w:id="23"/>
@@ -23845,7 +23863,7 @@
         <w:pStyle w:val="BodyText"/>
       </w:pPr>
       <w:r>
-        <w:t xml:space="preserve">The distributions are not approximately normal, especially for homicide and execution rates. The normality output shows large skewness for</w:t>
+        <w:t xml:space="preserve">All four variables show statistically significant departures from normality by Shapiro-Wilk tests:</w:t>
       </w:r>
       <w:r>
         <w:t xml:space="preserve"> </w:t>
@@ -23854,13 +23872,94 @@
         <w:rPr>
           <w:rStyle w:val="VerbatimChar"/>
         </w:rPr>
+        <w:t xml:space="preserve">edspend_pp</w:t>
+      </w:r>
+      <w:r>
+        <w:t xml:space="preserve"> </w:t>
+      </w:r>
+      <w:r>
+        <w:t xml:space="preserve">(</w:t>
+      </w:r>
+      <w:r>
+        <w:rPr>
+          <w:rStyle w:val="VerbatimChar"/>
+        </w:rPr>
+        <w:t xml:space="preserve">W = 0.906</w:t>
+      </w:r>
+      <w:r>
+        <w:t xml:space="preserve">,</w:t>
+      </w:r>
+      <w:r>
+        <w:t xml:space="preserve"> </w:t>
+      </w:r>
+      <w:r>
+        <w:rPr>
+          <w:rStyle w:val="VerbatimChar"/>
+        </w:rPr>
+        <w:t xml:space="preserve">p &lt; .001</w:t>
+      </w:r>
+      <w:r>
+        <w:t xml:space="preserve">),</w:t>
+      </w:r>
+      <w:r>
+        <w:t xml:space="preserve"> </w:t>
+      </w:r>
+      <w:r>
+        <w:rPr>
+          <w:rStyle w:val="VerbatimChar"/>
+        </w:rPr>
+        <w:t xml:space="preserve">read8th</w:t>
+      </w:r>
+      <w:r>
+        <w:t xml:space="preserve"> </w:t>
+      </w:r>
+      <w:r>
+        <w:t xml:space="preserve">(</w:t>
+      </w:r>
+      <w:r>
+        <w:rPr>
+          <w:rStyle w:val="VerbatimChar"/>
+        </w:rPr>
+        <w:t xml:space="preserve">W = 0.938</w:t>
+      </w:r>
+      <w:r>
+        <w:t xml:space="preserve">,</w:t>
+      </w:r>
+      <w:r>
+        <w:t xml:space="preserve"> </w:t>
+      </w:r>
+      <w:r>
+        <w:rPr>
+          <w:rStyle w:val="VerbatimChar"/>
+        </w:rPr>
+        <w:t xml:space="preserve">p = .010</w:t>
+      </w:r>
+      <w:r>
+        <w:t xml:space="preserve">),</w:t>
+      </w:r>
+      <w:r>
+        <w:t xml:space="preserve"> </w:t>
+      </w:r>
+      <w:r>
+        <w:rPr>
+          <w:rStyle w:val="VerbatimChar"/>
+        </w:rPr>
         <w:t xml:space="preserve">homrate_100k</w:t>
       </w:r>
       <w:r>
         <w:t xml:space="preserve"> </w:t>
       </w:r>
       <w:r>
-        <w:t xml:space="preserve">(4.50) and</w:t>
+        <w:t xml:space="preserve">(</w:t>
+      </w:r>
+      <w:r>
+        <w:rPr>
+          <w:rStyle w:val="VerbatimChar"/>
+        </w:rPr>
+        <w:t xml:space="preserve">W = 0.557</w:t>
+      </w:r>
+      <w:r>
+        <w:t xml:space="preserve">,</w:t>
       </w:r>
       <w:r>
         <w:t xml:space="preserve"> </w:t>
@@ -23869,24 +23968,60 @@
         <w:rPr>
           <w:rStyle w:val="VerbatimChar"/>
         </w:rPr>
+        <w:t xml:space="preserve">p &lt; .001</w:t>
+      </w:r>
+      <w:r>
+        <w:t xml:space="preserve">), and</w:t>
+      </w:r>
+      <w:r>
+        <w:t xml:space="preserve"> </w:t>
+      </w:r>
+      <w:r>
+        <w:rPr>
+          <w:rStyle w:val="VerbatimChar"/>
+        </w:rPr>
         <w:t xml:space="preserve">execrate_10m</w:t>
       </w:r>
       <w:r>
         <w:t xml:space="preserve"> </w:t>
       </w:r>
       <w:r>
-        <w:t xml:space="preserve">(1.74), and very low Shapiro-Wilk values (</w:t>
-      </w:r>
-      <w:r>
-        <w:rPr>
-          <w:rStyle w:val="VerbatimChar"/>
-        </w:rPr>
-        <w:t xml:space="preserve">W = 0.557</w:t>
+        <w:t xml:space="preserve">(</w:t>
+      </w:r>
+      <w:r>
+        <w:rPr>
+          <w:rStyle w:val="VerbatimChar"/>
+        </w:rPr>
+        <w:t xml:space="preserve">W = 0.602</w:t>
+      </w:r>
+      <w:r>
+        <w:t xml:space="preserve">,</w:t>
       </w:r>
       <w:r>
         <w:t xml:space="preserve"> </w:t>
       </w:r>
       <w:r>
+        <w:rPr>
+          <w:rStyle w:val="VerbatimChar"/>
+        </w:rPr>
+        <w:t xml:space="preserve">p &lt; .001</w:t>
+      </w:r>
+      <w:r>
+        <w:t xml:space="preserve">). Departures are especially strong for homicide and execution rates (skewness</w:t>
+      </w:r>
+      <w:r>
+        <w:t xml:space="preserve"> </w:t>
+      </w:r>
+      <w:r>
+        <w:rPr>
+          <w:rStyle w:val="VerbatimChar"/>
+        </w:rPr>
+        <w:t xml:space="preserve">= 4.50</w:t>
+      </w:r>
+      <w:r>
+        <w:t xml:space="preserve"> </w:t>
+      </w:r>
+      <w:r>
         <w:t xml:space="preserve">and</w:t>
       </w:r>
       <w:r>
@@ -23896,31 +24031,10 @@
         <w:rPr>
           <w:rStyle w:val="VerbatimChar"/>
         </w:rPr>
-        <w:t xml:space="preserve">W = 0.602</w:t>
-      </w:r>
-      <w:r>
-        <w:t xml:space="preserve">, both</w:t>
-      </w:r>
-      <w:r>
-        <w:t xml:space="preserve"> </w:t>
-      </w:r>
-      <w:r>
-        <w:rPr>
-          <w:rStyle w:val="VerbatimChar"/>
-        </w:rPr>
-        <w:t xml:space="preserve">p &lt; .001</w:t>
-      </w:r>
-      <w:r>
-        <w:t xml:space="preserve">). Even education spending and reading show significant non-normality (</w:t>
-      </w:r>
-      <w:r>
-        <w:rPr>
-          <w:rStyle w:val="VerbatimChar"/>
-        </w:rPr>
-        <w:t xml:space="preserve">p &lt; .05</w:t>
-      </w:r>
-      <w:r>
-        <w:t xml:space="preserve">) with visible skew and influential points in the plots. Because outliers can strongly influence Pearson estimates, the preferred analysis for both relationships is the 20% Winsorized correlation.</w:t>
+        <w:t xml:space="preserve">1.74</w:t>
+      </w:r>
+      <w:r>
+        <w:t xml:space="preserve">). Following the lab-session decision rule, the preferred estimator for both relationships is the 20% Winsorized correlation.</w:t>
       </w:r>
     </w:p>
     <w:bookmarkEnd w:id="49"/>
@@ -24659,7 +24773,7 @@
         <w:pStyle w:val="BodyText"/>
       </w:pPr>
       <w:r>
-        <w:t xml:space="preserve">Using the 20% Winsorized correlation, higher education spending per pupil was associated with higher 8th grade reading scores,</w:t>
+        <w:t xml:space="preserve">State education spending per pupil was positively associated with 8th-grade reading scores,</w:t>
       </w:r>
       <w:r>
         <w:t xml:space="preserve"> </w:t>
@@ -24683,7 +24797,10 @@
         <w:t xml:space="preserve">p = .005</w:t>
       </w:r>
       <w:r>
-        <w:t xml:space="preserve">.</w:t>
+        <w:t xml:space="preserve"> </w:t>
+      </w:r>
+      <w:r>
+        <w:t xml:space="preserve">(20% Winsorized correlation).</w:t>
       </w:r>
     </w:p>
     <w:p>
@@ -24691,7 +24808,7 @@
         <w:pStyle w:val="BodyText"/>
       </w:pPr>
       <w:r>
-        <w:t xml:space="preserve">Using the 20% Winsorized correlation, higher execution rates were associated with higher homicide rates,</w:t>
+        <w:t xml:space="preserve">State execution rates were positively associated with homicide rates,</w:t>
       </w:r>
       <w:r>
         <w:t xml:space="preserve"> </w:t>
@@ -24715,7 +24832,10 @@
         <w:t xml:space="preserve">p = .001</w:t>
       </w:r>
       <w:r>
-        <w:t xml:space="preserve">.</w:t>
+        <w:t xml:space="preserve"> </w:t>
+      </w:r>
+      <w:r>
+        <w:t xml:space="preserve">(20% Winsorized correlation).</w:t>
       </w:r>
     </w:p>
     <w:bookmarkEnd w:id="51"/>
@@ -24741,7 +24861,22 @@
         <w:pStyle w:val="BodyText"/>
       </w:pPr>
       <w:r>
-        <w:t xml:space="preserve">The Pearson correlation is sensitive to extreme points, and both relationships include influential observations that pull the linear fit toward weaker slopes. The Winsorized approach trims and shrinks the effect of those extremes, so the estimated associations reflect the central trend more strongly. That is why both Winsorized coefficients are larger than the corresponding Pearson coefficients.</w:t>
+        <w:t xml:space="preserve">Pearson</w:t>
+      </w:r>
+      <w:r>
+        <w:t xml:space="preserve"> </w:t>
+      </w:r>
+      <w:r>
+        <w:rPr>
+          <w:rStyle w:val="VerbatimChar"/>
+        </w:rPr>
+        <w:t xml:space="preserve">r</w:t>
+      </w:r>
+      <w:r>
+        <w:t xml:space="preserve"> </w:t>
+      </w:r>
+      <w:r>
+        <w:t xml:space="preserve">is sensitive to extreme cases. In these data, extreme states attenuate the linear association, so Pearson correlations are smaller. The 20% Winsorized procedure downweights those extremes and therefore returns larger coefficients.</w:t>
       </w:r>
     </w:p>
     <w:bookmarkEnd w:id="52"/>
@@ -24767,16 +24902,7 @@
         <w:pStyle w:val="BodyText"/>
       </w:pPr>
       <w:r>
-        <w:t xml:space="preserve">It would not change the correlation at all. Correlation is scale-invariant, so multiplying education spending by 1,000 changes the units but not the standardized association (</w:t>
-      </w:r>
-      <w:r>
-        <w:rPr>
-          <w:rStyle w:val="VerbatimChar"/>
-        </w:rPr>
-        <w:t xml:space="preserve">r</w:t>
-      </w:r>
-      <w:r>
-        <w:t xml:space="preserve">).</w:t>
+        <w:t xml:space="preserve">It would not change the correlation. Rescaling education spending from thousands of dollars to dollars multiplies the variable by a constant, and correlation is scale-invariant.</w:t>
       </w:r>
     </w:p>
     <w:bookmarkEnd w:id="53"/>
@@ -24802,7 +24928,7 @@
         <w:pStyle w:val="BodyText"/>
       </w:pPr>
       <w:r>
-        <w:t xml:space="preserve">No. A correlation from observational state-level data cannot establish causality. The result shows association, but it cannot rule out reverse causation, omitted variables, or confounding factors, so it cannot prove that executions cause homicide rates to rise.</w:t>
+        <w:t xml:space="preserve">No. This is an observational, cross-sectional correlation analysis, so it identifies association only. It cannot establish causal direction and cannot rule out confounding variables.</w:t>
       </w:r>
     </w:p>
     <w:bookmarkEnd w:id="54"/>

</xml_diff>